<commit_message>
format(math): enhance equation typography and numbering in competition report docx
</commit_message>
<xml_diff>
--- a/Laporan_Banjarmasin_Datathon_2026_SASITERA.docx
+++ b/Laporan_Banjarmasin_Datathon_2026_SASITERA.docx
@@ -522,13 +522,78 @@
           <w:rFonts w:ascii="Times New Roman" w:hAnsi="Times New Roman"/>
           <w:sz w:val="24"/>
         </w:rPr>
-        <w:t>Struktur komputasi Depthwise Separable Convolution memecah konvolusi standar menjadi dua tahap: konvolusi per saluran (Depthwise Convolution) yang dilanjutkan dengan konvolusi titik 1x1 (Pointwise Convolution). Reduksi biaya komputasi dinyatakan melalui persamaan efisiensi teoritis [5]:</w:t>
+        <w:t>Struktur komputasi Depthwise Separable Convolution memecah konvolusi standar menjadi dua tahap: konvolusi per saluran (Depthwise Convolution) yang dilanjutkan dengan konvolusi titik 1x1 (Pointwise Convolution). Rasio reduksi biaya komputasi teoritis diformulasikan pada Persamaan (2.1) [5]:</w:t>
       </w:r>
     </w:p>
+    <w:tbl>
+      <w:tblPr>
+        <w:tblW w:type="auto" w:w="0"/>
+        <w:jc w:val="center"/>
+        <w:tblLayout w:type="fixed"/>
+        <w:tblLook w:firstColumn="1" w:firstRow="1" w:lastColumn="0" w:lastRow="0" w:noHBand="0" w:noVBand="1" w:val="04A0"/>
+      </w:tblPr>
+      <w:tblGrid>
+        <w:gridCol w:w="3974"/>
+        <w:gridCol w:w="3974"/>
+      </w:tblGrid>
+      <w:tr>
+        <w:tc>
+          <w:tcPr>
+            <w:tcW w:type="dxa" w:w="7632"/>
+            <w:tcBorders>
+              <w:top w:val="none"/>
+              <w:left w:val="none"/>
+              <w:bottom w:val="none"/>
+              <w:right w:val="none"/>
+            </w:tcBorders>
+          </w:tcPr>
+          <w:p>
+            <w:pPr>
+              <w:spacing w:before="80" w:after="80" w:line="276" w:lineRule="auto"/>
+              <w:jc w:val="center"/>
+            </w:pPr>
+            <w:r>
+              <w:rPr>
+                <w:rFonts w:ascii="Times New Roman" w:hAnsi="Times New Roman"/>
+                <w:b/>
+                <w:i/>
+                <w:sz w:val="23"/>
+              </w:rPr>
+              <w:t>Rasio Reduksi = ( D_K * D_K * M * D_F^2 + M * N * D_F^2 ) / ( D_K^2 * M * N * D_F^2 ) = ( 1 / N ) + ( 1 / D_K^2 )</w:t>
+            </w:r>
+          </w:p>
+        </w:tc>
+        <w:tc>
+          <w:tcPr>
+            <w:tcW w:type="dxa" w:w="1152"/>
+            <w:tcBorders>
+              <w:top w:val="none"/>
+              <w:left w:val="none"/>
+              <w:bottom w:val="none"/>
+              <w:right w:val="none"/>
+            </w:tcBorders>
+          </w:tcPr>
+          <w:p>
+            <w:pPr>
+              <w:spacing w:before="80" w:after="80"/>
+              <w:jc w:val="right"/>
+            </w:pPr>
+            <w:r>
+              <w:rPr>
+                <w:rFonts w:ascii="Times New Roman" w:hAnsi="Times New Roman"/>
+                <w:b/>
+                <w:sz w:val="22"/>
+              </w:rPr>
+              <w:t>(2.1)</w:t>
+            </w:r>
+          </w:p>
+        </w:tc>
+      </w:tr>
+    </w:tbl>
     <w:p>
       <w:pPr>
         <w:spacing w:after="80" w:line="360" w:lineRule="auto"/>
-        <w:ind w:firstLine="576"/>
+        <w:ind w:firstLine="432"/>
         <w:jc w:val="both"/>
       </w:pPr>
       <w:r>
@@ -536,7 +601,7 @@
           <w:rFonts w:ascii="Times New Roman" w:hAnsi="Times New Roman"/>
           <w:sz w:val="24"/>
         </w:rPr>
-        <w:t>Reduksi Biaya = (D_K * D_K * M * D_F * D_F + M * N * D_F * D_F) / (D_K * D_K * M * N * D_F * D_F) = 1/N + 1/(D_K^2)</w:t>
+        <w:t>di mana D_K merepresentasikan ukuran kernel filter spasial (3 x 3), M adalah jumlah kanal input, N adalah jumlah kanal filter output, dan D_F adalah dimensi resolusi feature map. Dengan ukuran kernel standar D_K = 3, mekanisme ini menghasilkan efisiensi komputasi 8 hingga 9 kali lebih hemat dibandingkan konvolusi konvensional.</w:t>
       </w:r>
     </w:p>
     <w:p>
@@ -550,9 +615,74 @@
           <w:rFonts w:ascii="Times New Roman" w:hAnsi="Times New Roman"/>
           <w:sz w:val="24"/>
         </w:rPr>
-        <w:t>di mana D_K adalah ukuran kernel filter (3x3), M adalah jumlah kanal input, N adalah jumlah kanal output, dan D_F adalah dimensi spasial feature map. Dengan kernel 3x3, MobileNetV2 menghemat komputasi 8 hingga 9 kali lipat dibandingkan konvolusi standar tanpa mengorbankan representasi fitur spasial tekstur kain.</w:t>
+        <w:t>Lapisan classifier head dimodifikasi secara khusus untuk klasifikasi 4 kelas motif Sasirangan dengan struktur: Linear Layer (1280 -&gt; 128) -&gt; ReLU Activation -&gt; Dropout (p = 0.3) -&gt; Linear Layer (128 -&gt; 4). Fungsi objektif pelatihan dioptimasi menggunakan Multi-Class Cross-Entropy Loss pada Persamaan (2.2):</w:t>
       </w:r>
     </w:p>
+    <w:tbl>
+      <w:tblPr>
+        <w:tblW w:type="auto" w:w="0"/>
+        <w:jc w:val="center"/>
+        <w:tblLayout w:type="fixed"/>
+        <w:tblLook w:firstColumn="1" w:firstRow="1" w:lastColumn="0" w:lastRow="0" w:noHBand="0" w:noVBand="1" w:val="04A0"/>
+      </w:tblPr>
+      <w:tblGrid>
+        <w:gridCol w:w="3974"/>
+        <w:gridCol w:w="3974"/>
+      </w:tblGrid>
+      <w:tr>
+        <w:tc>
+          <w:tcPr>
+            <w:tcW w:type="dxa" w:w="7632"/>
+            <w:tcBorders>
+              <w:top w:val="none"/>
+              <w:left w:val="none"/>
+              <w:bottom w:val="none"/>
+              <w:right w:val="none"/>
+            </w:tcBorders>
+          </w:tcPr>
+          <w:p>
+            <w:pPr>
+              <w:spacing w:before="80" w:after="80" w:line="276" w:lineRule="auto"/>
+              <w:jc w:val="center"/>
+            </w:pPr>
+            <w:r>
+              <w:rPr>
+                <w:rFonts w:ascii="Times New Roman" w:hAnsi="Times New Roman"/>
+                <w:b/>
+                <w:i/>
+                <w:sz w:val="23"/>
+              </w:rPr>
+              <w:t>L_{CE} = - sum_{c=1}^{C} y_c * ln( y_hat_c )</w:t>
+            </w:r>
+          </w:p>
+        </w:tc>
+        <w:tc>
+          <w:tcPr>
+            <w:tcW w:type="dxa" w:w="1152"/>
+            <w:tcBorders>
+              <w:top w:val="none"/>
+              <w:left w:val="none"/>
+              <w:bottom w:val="none"/>
+              <w:right w:val="none"/>
+            </w:tcBorders>
+          </w:tcPr>
+          <w:p>
+            <w:pPr>
+              <w:spacing w:before="80" w:after="80"/>
+              <w:jc w:val="right"/>
+            </w:pPr>
+            <w:r>
+              <w:rPr>
+                <w:rFonts w:ascii="Times New Roman" w:hAnsi="Times New Roman"/>
+                <w:b/>
+                <w:sz w:val="22"/>
+              </w:rPr>
+              <w:t>(2.2)</w:t>
+            </w:r>
+          </w:p>
+        </w:tc>
+      </w:tr>
+    </w:tbl>
     <w:p>
       <w:pPr>
         <w:spacing w:after="80" w:line="360" w:lineRule="auto"/>
@@ -564,23 +694,74 @@
           <w:rFonts w:ascii="Times New Roman" w:hAnsi="Times New Roman"/>
           <w:sz w:val="24"/>
         </w:rPr>
-        <w:t>Lapisan classifier head dimodifikasi secara khusus untuk klasifikasi 4 kelas motif Sasirangan dengan struktur: Linear Layer (1280 -&gt; 128) -&gt; ReLU Activation -&gt; Dropout (p = 0.3) -&gt; Linear Layer (128 -&gt; 4). Model dioptimasi menggunakan fungsi Cross-Entropy Loss multi-kelas:</w:t>
+        <w:t>di mana C = 4 kelas motif, y_c adalah label ground-truth biner (one-hot vector), dan y_hat_c adalah probabilitas kelas hasil normalisasi fungsi Softmax pada Persamaan (2.3):</w:t>
       </w:r>
     </w:p>
-    <w:p>
-      <w:pPr>
-        <w:spacing w:after="80" w:line="360" w:lineRule="auto"/>
-        <w:ind w:firstLine="576"/>
-        <w:jc w:val="both"/>
-      </w:pPr>
-      <w:r>
-        <w:rPr>
-          <w:rFonts w:ascii="Times New Roman" w:hAnsi="Times New Roman"/>
-          <w:sz w:val="24"/>
-        </w:rPr>
-        <w:t>Loss = - sum_{c=1}^{C} y_c * log(y_hat_c)</w:t>
-      </w:r>
-    </w:p>
+    <w:tbl>
+      <w:tblPr>
+        <w:tblW w:type="auto" w:w="0"/>
+        <w:jc w:val="center"/>
+        <w:tblLayout w:type="fixed"/>
+        <w:tblLook w:firstColumn="1" w:firstRow="1" w:lastColumn="0" w:lastRow="0" w:noHBand="0" w:noVBand="1" w:val="04A0"/>
+      </w:tblPr>
+      <w:tblGrid>
+        <w:gridCol w:w="3974"/>
+        <w:gridCol w:w="3974"/>
+      </w:tblGrid>
+      <w:tr>
+        <w:tc>
+          <w:tcPr>
+            <w:tcW w:type="dxa" w:w="7632"/>
+            <w:tcBorders>
+              <w:top w:val="none"/>
+              <w:left w:val="none"/>
+              <w:bottom w:val="none"/>
+              <w:right w:val="none"/>
+            </w:tcBorders>
+          </w:tcPr>
+          <w:p>
+            <w:pPr>
+              <w:spacing w:before="80" w:after="80" w:line="276" w:lineRule="auto"/>
+              <w:jc w:val="center"/>
+            </w:pPr>
+            <w:r>
+              <w:rPr>
+                <w:rFonts w:ascii="Times New Roman" w:hAnsi="Times New Roman"/>
+                <w:b/>
+                <w:i/>
+                <w:sz w:val="23"/>
+              </w:rPr>
+              <w:t>y_hat_c = exp( z_c ) / sum_{j=1}^{C} exp( z_j )</w:t>
+            </w:r>
+          </w:p>
+        </w:tc>
+        <w:tc>
+          <w:tcPr>
+            <w:tcW w:type="dxa" w:w="1152"/>
+            <w:tcBorders>
+              <w:top w:val="none"/>
+              <w:left w:val="none"/>
+              <w:bottom w:val="none"/>
+              <w:right w:val="none"/>
+            </w:tcBorders>
+          </w:tcPr>
+          <w:p>
+            <w:pPr>
+              <w:spacing w:before="80" w:after="80"/>
+              <w:jc w:val="right"/>
+            </w:pPr>
+            <w:r>
+              <w:rPr>
+                <w:rFonts w:ascii="Times New Roman" w:hAnsi="Times New Roman"/>
+                <w:b/>
+                <w:sz w:val="22"/>
+              </w:rPr>
+              <w:t>(2.3)</w:t>
+            </w:r>
+          </w:p>
+        </w:tc>
+      </w:tr>
+    </w:tbl>
     <w:p>
       <w:pPr>
         <w:spacing w:after="80" w:line="360" w:lineRule="auto"/>
@@ -592,7 +773,7 @@
           <w:rFonts w:ascii="Times New Roman" w:hAnsi="Times New Roman"/>
           <w:sz w:val="24"/>
         </w:rPr>
-        <w:t>di mana C = 4 kelas motif, y_c adalah ground-truth biner (one-hot encoding), dan y_hat_c adalah probabilitas softmax. Pelatihan dijalankan selama 15 epoch menggunakan optimizer Adam dengan learning rate 0,0001 dan batch size = 16.</w:t>
+        <w:t>Pelatihan dijalankan selama 15 epoch menggunakan optimizer Adam dengan laju pembelajaran (learning rate) eta = 0,0001 dan ukuran batch (batch size) = 16.</w:t>
       </w:r>
     </w:p>
     <w:p>
@@ -620,7 +801,86 @@
           <w:rFonts w:ascii="Times New Roman" w:hAnsi="Times New Roman"/>
           <w:sz w:val="24"/>
         </w:rPr>
-        <w:t>Untuk mengidentifikasi konsentrasi spasial dan derajat spesialisasi industri Sasirangan antar kecamatan, digunakan analisis ekonomi regional Location Quotient (LQ) [6]:</w:t>
+        <w:t>Untuk mengukur derajat konsentrasi spasial dan spesialisasi industri Sasirangan pada tingkat kecamatan, digunakan formulasi Location Quotient (LQ) pada Persamaan (2.4) [6]:</w:t>
+      </w:r>
+    </w:p>
+    <w:tbl>
+      <w:tblPr>
+        <w:tblW w:type="auto" w:w="0"/>
+        <w:jc w:val="center"/>
+        <w:tblLayout w:type="fixed"/>
+        <w:tblLook w:firstColumn="1" w:firstRow="1" w:lastColumn="0" w:lastRow="0" w:noHBand="0" w:noVBand="1" w:val="04A0"/>
+      </w:tblPr>
+      <w:tblGrid>
+        <w:gridCol w:w="3974"/>
+        <w:gridCol w:w="3974"/>
+      </w:tblGrid>
+      <w:tr>
+        <w:tc>
+          <w:tcPr>
+            <w:tcW w:type="dxa" w:w="7632"/>
+            <w:tcBorders>
+              <w:top w:val="none"/>
+              <w:left w:val="none"/>
+              <w:bottom w:val="none"/>
+              <w:right w:val="none"/>
+            </w:tcBorders>
+          </w:tcPr>
+          <w:p>
+            <w:pPr>
+              <w:spacing w:before="80" w:after="80" w:line="276" w:lineRule="auto"/>
+              <w:jc w:val="center"/>
+            </w:pPr>
+            <w:r>
+              <w:rPr>
+                <w:rFonts w:ascii="Times New Roman" w:hAnsi="Times New Roman"/>
+                <w:b/>
+                <w:i/>
+                <w:sz w:val="23"/>
+              </w:rPr>
+              <w:t>LQ_i = ( e_i / e ) / ( E_i / E )</w:t>
+            </w:r>
+          </w:p>
+        </w:tc>
+        <w:tc>
+          <w:tcPr>
+            <w:tcW w:type="dxa" w:w="1152"/>
+            <w:tcBorders>
+              <w:top w:val="none"/>
+              <w:left w:val="none"/>
+              <w:bottom w:val="none"/>
+              <w:right w:val="none"/>
+            </w:tcBorders>
+          </w:tcPr>
+          <w:p>
+            <w:pPr>
+              <w:spacing w:before="80" w:after="80"/>
+              <w:jc w:val="right"/>
+            </w:pPr>
+            <w:r>
+              <w:rPr>
+                <w:rFonts w:ascii="Times New Roman" w:hAnsi="Times New Roman"/>
+                <w:b/>
+                <w:sz w:val="22"/>
+              </w:rPr>
+              <w:t>(2.4)</w:t>
+            </w:r>
+          </w:p>
+        </w:tc>
+      </w:tr>
+    </w:tbl>
+    <w:p>
+      <w:pPr>
+        <w:spacing w:after="80" w:line="360" w:lineRule="auto"/>
+        <w:ind w:firstLine="432"/>
+        <w:jc w:val="both"/>
+      </w:pPr>
+      <w:r>
+        <w:rPr>
+          <w:rFonts w:ascii="Times New Roman" w:hAnsi="Times New Roman"/>
+          <w:sz w:val="24"/>
+        </w:rPr>
+        <w:t>di mana e_i adalah jumlah industri Sasirangan di kecamatan i, e adalah total industri Sasirangan di Kota Banjarmasin (249 unit), E_i adalah jumlah total UMKM di kecamatan i, dan E adalah total UMKM di seluruh Kota Banjarmasin (26.824 unit). Interpretasi nilai:</w:t>
       </w:r>
     </w:p>
     <w:p>
@@ -634,21 +894,7 @@
           <w:rFonts w:ascii="Times New Roman" w:hAnsi="Times New Roman"/>
           <w:sz w:val="24"/>
         </w:rPr>
-        <w:t>LQ_i = (e_i / e) / (E_i / E)</w:t>
-      </w:r>
-    </w:p>
-    <w:p>
-      <w:pPr>
-        <w:spacing w:after="80" w:line="360" w:lineRule="auto"/>
-        <w:ind w:firstLine="432"/>
-        <w:jc w:val="both"/>
-      </w:pPr>
-      <w:r>
-        <w:rPr>
-          <w:rFonts w:ascii="Times New Roman" w:hAnsi="Times New Roman"/>
-          <w:sz w:val="24"/>
-        </w:rPr>
-        <w:t>di mana e_i adalah jumlah industri Sasirangan di kecamatan i, e adalah total industri Sasirangan di Kota Banjarmasin (249 unit), E_i adalah jumlah total UMKM di kecamatan i, dan E adalah total UMKM di seluruh Kota Banjarmasin (26.824 unit). Kriteria interpretasi LQ:</w:t>
+        <w:t>• LQ &gt; 1.0 : Kecamatan berstatus Sektor Basis Unggulan (keunggulan komparatif tinggi).</w:t>
       </w:r>
     </w:p>
     <w:p>
@@ -662,21 +908,7 @@
           <w:rFonts w:ascii="Times New Roman" w:hAnsi="Times New Roman"/>
           <w:sz w:val="24"/>
         </w:rPr>
-        <w:t>• LQ &gt; 1.0: Kecamatan memiliki konsentrasi spesialisasi relatif lebih tinggi dibandingkan rata-rata kota, mengindikasikan Sektor Basis Unggulan yang potensial menjadi pusat ekspor komparatif.</w:t>
-      </w:r>
-    </w:p>
-    <w:p>
-      <w:pPr>
-        <w:spacing w:after="80" w:line="360" w:lineRule="auto"/>
-        <w:ind w:firstLine="576"/>
-        <w:jc w:val="both"/>
-      </w:pPr>
-      <w:r>
-        <w:rPr>
-          <w:rFonts w:ascii="Times New Roman" w:hAnsi="Times New Roman"/>
-          <w:sz w:val="24"/>
-        </w:rPr>
-        <w:t>• LQ &lt;= 1.0: Kecamatan berstatus Sektor Non-Basis, di mana keberadaan industri Sasirangan belum mencapai skala spesialisasi regional.</w:t>
+        <w:t>• LQ &lt;= 1.0: Kecamatan berstatus Sektor Non-Basis (belum mencapai skala spesialisasi).</w:t>
       </w:r>
     </w:p>
     <w:p>
@@ -704,23 +936,204 @@
           <w:rFonts w:ascii="Times New Roman" w:hAnsi="Times New Roman"/>
           <w:sz w:val="24"/>
         </w:rPr>
-        <w:t>Kinerja inferensi model diuji menggunakan empat metrik evaluasi standar pembelajaran mesin: Accuracy, Precision, Recall, dan F1-Score berbasis Confusion Matrix [7]:</w:t>
+        <w:t>Kinerja model diuji menggunakan metrik evaluasi standar: Accuracy, Precision, Recall, dan F1-Score yang diformulasikan pada Persamaan (2.5a)-(2.5c) berbasis Confusion Matrix [7]:</w:t>
       </w:r>
     </w:p>
-    <w:p>
-      <w:pPr>
-        <w:spacing w:after="80" w:line="360" w:lineRule="auto"/>
-        <w:ind w:firstLine="576"/>
-        <w:jc w:val="both"/>
-      </w:pPr>
-      <w:r>
-        <w:rPr>
-          <w:rFonts w:ascii="Times New Roman" w:hAnsi="Times New Roman"/>
-          <w:sz w:val="24"/>
-        </w:rPr>
-        <w:t>Accuracy = (TP + TN) / (TP + TN + FP + FN), Precision = TP / (TP + FP), Recall = TP / (TP + FN), F1-Score = 2 * (Precision * Recall) / (Precision + Recall)</w:t>
-      </w:r>
-    </w:p>
+    <w:tbl>
+      <w:tblPr>
+        <w:tblW w:type="auto" w:w="0"/>
+        <w:jc w:val="center"/>
+        <w:tblLayout w:type="fixed"/>
+        <w:tblLook w:firstColumn="1" w:firstRow="1" w:lastColumn="0" w:lastRow="0" w:noHBand="0" w:noVBand="1" w:val="04A0"/>
+      </w:tblPr>
+      <w:tblGrid>
+        <w:gridCol w:w="3974"/>
+        <w:gridCol w:w="3974"/>
+      </w:tblGrid>
+      <w:tr>
+        <w:tc>
+          <w:tcPr>
+            <w:tcW w:type="dxa" w:w="7632"/>
+            <w:tcBorders>
+              <w:top w:val="none"/>
+              <w:left w:val="none"/>
+              <w:bottom w:val="none"/>
+              <w:right w:val="none"/>
+            </w:tcBorders>
+          </w:tcPr>
+          <w:p>
+            <w:pPr>
+              <w:spacing w:before="80" w:after="80" w:line="276" w:lineRule="auto"/>
+              <w:jc w:val="center"/>
+            </w:pPr>
+            <w:r>
+              <w:rPr>
+                <w:rFonts w:ascii="Times New Roman" w:hAnsi="Times New Roman"/>
+                <w:b/>
+                <w:i/>
+                <w:sz w:val="23"/>
+              </w:rPr>
+              <w:t>Accuracy = ( TP + TN ) / ( TP + TN + FP + FN )</w:t>
+            </w:r>
+          </w:p>
+        </w:tc>
+        <w:tc>
+          <w:tcPr>
+            <w:tcW w:type="dxa" w:w="1152"/>
+            <w:tcBorders>
+              <w:top w:val="none"/>
+              <w:left w:val="none"/>
+              <w:bottom w:val="none"/>
+              <w:right w:val="none"/>
+            </w:tcBorders>
+          </w:tcPr>
+          <w:p>
+            <w:pPr>
+              <w:spacing w:before="80" w:after="80"/>
+              <w:jc w:val="right"/>
+            </w:pPr>
+            <w:r>
+              <w:rPr>
+                <w:rFonts w:ascii="Times New Roman" w:hAnsi="Times New Roman"/>
+                <w:b/>
+                <w:sz w:val="22"/>
+              </w:rPr>
+              <w:t>(2.5a)</w:t>
+            </w:r>
+          </w:p>
+        </w:tc>
+      </w:tr>
+    </w:tbl>
+    <w:tbl>
+      <w:tblPr>
+        <w:tblW w:type="auto" w:w="0"/>
+        <w:jc w:val="center"/>
+        <w:tblLayout w:type="fixed"/>
+        <w:tblLook w:firstColumn="1" w:firstRow="1" w:lastColumn="0" w:lastRow="0" w:noHBand="0" w:noVBand="1" w:val="04A0"/>
+      </w:tblPr>
+      <w:tblGrid>
+        <w:gridCol w:w="3974"/>
+        <w:gridCol w:w="3974"/>
+      </w:tblGrid>
+      <w:tr>
+        <w:tc>
+          <w:tcPr>
+            <w:tcW w:type="dxa" w:w="7632"/>
+            <w:tcBorders>
+              <w:top w:val="none"/>
+              <w:left w:val="none"/>
+              <w:bottom w:val="none"/>
+              <w:right w:val="none"/>
+            </w:tcBorders>
+          </w:tcPr>
+          <w:p>
+            <w:pPr>
+              <w:spacing w:before="80" w:after="80" w:line="276" w:lineRule="auto"/>
+              <w:jc w:val="center"/>
+            </w:pPr>
+            <w:r>
+              <w:rPr>
+                <w:rFonts w:ascii="Times New Roman" w:hAnsi="Times New Roman"/>
+                <w:b/>
+                <w:i/>
+                <w:sz w:val="23"/>
+              </w:rPr>
+              <w:t>Precision = TP / ( TP + FP ) ,    Recall = TP / ( TP + FN )</w:t>
+            </w:r>
+          </w:p>
+        </w:tc>
+        <w:tc>
+          <w:tcPr>
+            <w:tcW w:type="dxa" w:w="1152"/>
+            <w:tcBorders>
+              <w:top w:val="none"/>
+              <w:left w:val="none"/>
+              <w:bottom w:val="none"/>
+              <w:right w:val="none"/>
+            </w:tcBorders>
+          </w:tcPr>
+          <w:p>
+            <w:pPr>
+              <w:spacing w:before="80" w:after="80"/>
+              <w:jc w:val="right"/>
+            </w:pPr>
+            <w:r>
+              <w:rPr>
+                <w:rFonts w:ascii="Times New Roman" w:hAnsi="Times New Roman"/>
+                <w:b/>
+                <w:sz w:val="22"/>
+              </w:rPr>
+              <w:t>(2.5b)</w:t>
+            </w:r>
+          </w:p>
+        </w:tc>
+      </w:tr>
+    </w:tbl>
+    <w:tbl>
+      <w:tblPr>
+        <w:tblW w:type="auto" w:w="0"/>
+        <w:jc w:val="center"/>
+        <w:tblLayout w:type="fixed"/>
+        <w:tblLook w:firstColumn="1" w:firstRow="1" w:lastColumn="0" w:lastRow="0" w:noHBand="0" w:noVBand="1" w:val="04A0"/>
+      </w:tblPr>
+      <w:tblGrid>
+        <w:gridCol w:w="3974"/>
+        <w:gridCol w:w="3974"/>
+      </w:tblGrid>
+      <w:tr>
+        <w:tc>
+          <w:tcPr>
+            <w:tcW w:type="dxa" w:w="7632"/>
+            <w:tcBorders>
+              <w:top w:val="none"/>
+              <w:left w:val="none"/>
+              <w:bottom w:val="none"/>
+              <w:right w:val="none"/>
+            </w:tcBorders>
+          </w:tcPr>
+          <w:p>
+            <w:pPr>
+              <w:spacing w:before="80" w:after="80" w:line="276" w:lineRule="auto"/>
+              <w:jc w:val="center"/>
+            </w:pPr>
+            <w:r>
+              <w:rPr>
+                <w:rFonts w:ascii="Times New Roman" w:hAnsi="Times New Roman"/>
+                <w:b/>
+                <w:i/>
+                <w:sz w:val="23"/>
+              </w:rPr>
+              <w:t>F1-Score = 2 * ( Precision * Recall ) / ( Precision + Recall )</w:t>
+            </w:r>
+          </w:p>
+        </w:tc>
+        <w:tc>
+          <w:tcPr>
+            <w:tcW w:type="dxa" w:w="1152"/>
+            <w:tcBorders>
+              <w:top w:val="none"/>
+              <w:left w:val="none"/>
+              <w:bottom w:val="none"/>
+              <w:right w:val="none"/>
+            </w:tcBorders>
+          </w:tcPr>
+          <w:p>
+            <w:pPr>
+              <w:spacing w:before="80" w:after="80"/>
+              <w:jc w:val="right"/>
+            </w:pPr>
+            <w:r>
+              <w:rPr>
+                <w:rFonts w:ascii="Times New Roman" w:hAnsi="Times New Roman"/>
+                <w:b/>
+                <w:sz w:val="22"/>
+              </w:rPr>
+              <w:t>(2.5c)</w:t>
+            </w:r>
+          </w:p>
+        </w:tc>
+      </w:tr>
+    </w:tbl>
     <w:p>
       <w:r>
         <w:br w:type="page"/>
@@ -2845,7 +3258,86 @@
           <w:rFonts w:ascii="Times New Roman" w:hAnsi="Times New Roman"/>
           <w:sz w:val="24"/>
         </w:rPr>
-        <w:t>Analisis distribusi Pareto pada Tabel 3.2 menunjukkan bahwa hanya 2 kelurahan (Seberang Mesjid dan Sungai Jingah) telah menguasai 35,34% (88 unit) dari total seluruh ekosistem industri Sasirangan di Kota Banjarmasin. Kelurahan Seberang Mesjid (dikenal sebagai Kampung Sasirangan) menjadi episentrum utama perajin, sementara Sungai Jingah berkembang pesat sebagai sentra kreatif berbasis kearifan lokal rumah adat Banjar. Uji korelasi Pearson antara jumlah industri dengan populasi UMKM umum menghasilkan nilai r = -0,3212 (p = 0,5982), yang menegaskan bahwa sebaran industri Sasirangan tidak mengikuti pola pertumbuhan bisnis umum, melainkan terkonsentrasi spasial akibat faktor kultural historis dan aksesibilitas sungai.</w:t>
+        <w:t>Analisis distribusi Pareto pada Tabel 3.2 menunjukkan bahwa hanya 2 kelurahan (Seberang Mesjid dan Sungai Jingah) telah menguasai 35,34% (88 unit) dari total seluruh ekosistem industri Sasirangan di Kota Banjarmasin. Uji korelasi Pearson antara jumlah industri (X) dengan populasi UMKM umum (Y) diformulasikan pada Persamaan (3.1) [12]:</w:t>
+      </w:r>
+    </w:p>
+    <w:tbl>
+      <w:tblPr>
+        <w:tblW w:type="auto" w:w="0"/>
+        <w:jc w:val="center"/>
+        <w:tblLayout w:type="fixed"/>
+        <w:tblLook w:firstColumn="1" w:firstRow="1" w:lastColumn="0" w:lastRow="0" w:noHBand="0" w:noVBand="1" w:val="04A0"/>
+      </w:tblPr>
+      <w:tblGrid>
+        <w:gridCol w:w="3974"/>
+        <w:gridCol w:w="3974"/>
+      </w:tblGrid>
+      <w:tr>
+        <w:tc>
+          <w:tcPr>
+            <w:tcW w:type="dxa" w:w="7632"/>
+            <w:tcBorders>
+              <w:top w:val="none"/>
+              <w:left w:val="none"/>
+              <w:bottom w:val="none"/>
+              <w:right w:val="none"/>
+            </w:tcBorders>
+          </w:tcPr>
+          <w:p>
+            <w:pPr>
+              <w:spacing w:before="80" w:after="80" w:line="276" w:lineRule="auto"/>
+              <w:jc w:val="center"/>
+            </w:pPr>
+            <w:r>
+              <w:rPr>
+                <w:rFonts w:ascii="Times New Roman" w:hAnsi="Times New Roman"/>
+                <w:b/>
+                <w:i/>
+                <w:sz w:val="23"/>
+              </w:rPr>
+              <w:t>r = sum( ( X_i - X_bar ) * ( Y_i - Y_bar ) ) / sqrt( sum( X_i - X_bar )^2 * sum( Y_i - Y_bar )^2 )</w:t>
+            </w:r>
+          </w:p>
+        </w:tc>
+        <w:tc>
+          <w:tcPr>
+            <w:tcW w:type="dxa" w:w="1152"/>
+            <w:tcBorders>
+              <w:top w:val="none"/>
+              <w:left w:val="none"/>
+              <w:bottom w:val="none"/>
+              <w:right w:val="none"/>
+            </w:tcBorders>
+          </w:tcPr>
+          <w:p>
+            <w:pPr>
+              <w:spacing w:before="80" w:after="80"/>
+              <w:jc w:val="right"/>
+            </w:pPr>
+            <w:r>
+              <w:rPr>
+                <w:rFonts w:ascii="Times New Roman" w:hAnsi="Times New Roman"/>
+                <w:b/>
+                <w:sz w:val="22"/>
+              </w:rPr>
+              <w:t>(3.1)</w:t>
+            </w:r>
+          </w:p>
+        </w:tc>
+      </w:tr>
+    </w:tbl>
+    <w:p>
+      <w:pPr>
+        <w:spacing w:after="80" w:line="360" w:lineRule="auto"/>
+        <w:ind w:firstLine="432"/>
+        <w:jc w:val="both"/>
+      </w:pPr>
+      <w:r>
+        <w:rPr>
+          <w:rFonts w:ascii="Times New Roman" w:hAnsi="Times New Roman"/>
+          <w:sz w:val="24"/>
+        </w:rPr>
+        <w:t>Hasil uji komputasi menghasilkan nilai r = -0,3212 (p-value = 0,5982), yang menegaskan bahwa sebaran industri Sasirangan tidak berkorelasi linier dengan populasi usaha umum, melainkan terkonsentrasi spasial akibat faktor kultural historis dan aksesibilitas sungai Martapura.</w:t>
       </w:r>
     </w:p>
     <w:p>

</xml_diff>

<commit_message>
docs: enrich report appendices with full visual diagrams, pareto charts, and motif sample references
</commit_message>
<xml_diff>
--- a/Laporan_Banjarmasin_Datathon_2026_SASITERA.docx
+++ b/Laporan_Banjarmasin_Datathon_2026_SASITERA.docx
@@ -4935,7 +4935,7 @@
           <w:b/>
           <w:sz w:val="24"/>
         </w:rPr>
-        <w:t>Lampiran 2: Dokumentasi Antarmuka Platform SASITERA.ID</w:t>
+        <w:t>Lampiran 2: Dokumentasi Visual Analisis Spasial &amp; Platform SASITERA.ID</w:t>
       </w:r>
     </w:p>
     <w:p>
@@ -4985,6 +4985,349 @@
           <w:sz w:val="19"/>
         </w:rPr>
         <w:t>Lampiran Gambar 1: Identitas Visual Resmi SASITERA.ID (A New Story Is Being Made)</w:t>
+      </w:r>
+    </w:p>
+    <w:p>
+      <w:r>
+        <w:drawing>
+          <wp:inline xmlns:a="http://schemas.openxmlformats.org/drawingml/2006/main" xmlns:pic="http://schemas.openxmlformats.org/drawingml/2006/picture">
+            <wp:extent cx="4572000" cy="2514600"/>
+            <wp:docPr id="5" name="Picture 5"/>
+            <wp:cNvGraphicFramePr>
+              <a:graphicFrameLocks noChangeAspect="1"/>
+            </wp:cNvGraphicFramePr>
+            <a:graphic>
+              <a:graphicData uri="http://schemas.openxmlformats.org/drawingml/2006/picture">
+                <pic:pic>
+                  <pic:nvPicPr>
+                    <pic:cNvPr id="0" name="spasial_aglomerasi_kelurahan.png"/>
+                    <pic:cNvPicPr/>
+                  </pic:nvPicPr>
+                  <pic:blipFill>
+                    <a:blip r:embed="rId13"/>
+                    <a:stretch>
+                      <a:fillRect/>
+                    </a:stretch>
+                  </pic:blipFill>
+                  <pic:spPr>
+                    <a:xfrm>
+                      <a:off x="0" y="0"/>
+                      <a:ext cx="4572000" cy="2514600"/>
+                    </a:xfrm>
+                    <a:prstGeom prst="rect"/>
+                  </pic:spPr>
+                </pic:pic>
+              </a:graphicData>
+            </a:graphic>
+          </wp:inline>
+        </w:drawing>
+      </w:r>
+    </w:p>
+    <w:p>
+      <w:pPr>
+        <w:spacing w:after="160"/>
+        <w:jc w:val="center"/>
+      </w:pPr>
+      <w:r>
+        <w:rPr>
+          <w:b/>
+          <w:sz w:val="19"/>
+        </w:rPr>
+        <w:t>Lampiran Gambar 2: Kurva Pareto Aglomerasi Sentra Sasirangan Top 10 Kelurahan</w:t>
+      </w:r>
+    </w:p>
+    <w:p>
+      <w:r>
+        <w:drawing>
+          <wp:inline xmlns:a="http://schemas.openxmlformats.org/drawingml/2006/main" xmlns:pic="http://schemas.openxmlformats.org/drawingml/2006/picture">
+            <wp:extent cx="4572000" cy="2420471"/>
+            <wp:docPr id="6" name="Picture 6"/>
+            <wp:cNvGraphicFramePr>
+              <a:graphicFrameLocks noChangeAspect="1"/>
+            </wp:cNvGraphicFramePr>
+            <a:graphic>
+              <a:graphicData uri="http://schemas.openxmlformats.org/drawingml/2006/picture">
+                <pic:pic>
+                  <pic:nvPicPr>
+                    <pic:cNvPr id="0" name="struktur_kbli_ekraf.png"/>
+                    <pic:cNvPicPr/>
+                  </pic:nvPicPr>
+                  <pic:blipFill>
+                    <a:blip r:embed="rId14"/>
+                    <a:stretch>
+                      <a:fillRect/>
+                    </a:stretch>
+                  </pic:blipFill>
+                  <pic:spPr>
+                    <a:xfrm>
+                      <a:off x="0" y="0"/>
+                      <a:ext cx="4572000" cy="2420471"/>
+                    </a:xfrm>
+                    <a:prstGeom prst="rect"/>
+                  </pic:spPr>
+                </pic:pic>
+              </a:graphicData>
+            </a:graphic>
+          </wp:inline>
+        </w:drawing>
+      </w:r>
+    </w:p>
+    <w:p>
+      <w:pPr>
+        <w:spacing w:after="160"/>
+        <w:jc w:val="center"/>
+      </w:pPr>
+      <w:r>
+        <w:rPr>
+          <w:b/>
+          <w:sz w:val="19"/>
+        </w:rPr>
+        <w:t>Lampiran Gambar 3: Struktur Rantai Pasok KBLI Industri Kreatif Tekstil</w:t>
+      </w:r>
+    </w:p>
+    <w:p>
+      <w:r>
+        <w:drawing>
+          <wp:inline xmlns:a="http://schemas.openxmlformats.org/drawingml/2006/main" xmlns:pic="http://schemas.openxmlformats.org/drawingml/2006/picture">
+            <wp:extent cx="4572000" cy="1905000"/>
+            <wp:docPr id="7" name="Picture 7"/>
+            <wp:cNvGraphicFramePr>
+              <a:graphicFrameLocks noChangeAspect="1"/>
+            </wp:cNvGraphicFramePr>
+            <a:graphic>
+              <a:graphicData uri="http://schemas.openxmlformats.org/drawingml/2006/picture">
+                <pic:pic>
+                  <pic:nvPicPr>
+                    <pic:cNvPr id="0" name="training_curves.png"/>
+                    <pic:cNvPicPr/>
+                  </pic:nvPicPr>
+                  <pic:blipFill>
+                    <a:blip r:embed="rId15"/>
+                    <a:stretch>
+                      <a:fillRect/>
+                    </a:stretch>
+                  </pic:blipFill>
+                  <pic:spPr>
+                    <a:xfrm>
+                      <a:off x="0" y="0"/>
+                      <a:ext cx="4572000" cy="1905000"/>
+                    </a:xfrm>
+                    <a:prstGeom prst="rect"/>
+                  </pic:spPr>
+                </pic:pic>
+              </a:graphicData>
+            </a:graphic>
+          </wp:inline>
+        </w:drawing>
+      </w:r>
+    </w:p>
+    <w:p>
+      <w:pPr>
+        <w:spacing w:after="160"/>
+        <w:jc w:val="center"/>
+      </w:pPr>
+      <w:r>
+        <w:rPr>
+          <w:b/>
+          <w:sz w:val="19"/>
+        </w:rPr>
+        <w:t>Lampiran Gambar 4: Kurva Pelatihan Akurasi dan Loss Model CNN MobileNetV2 (15 Epochs)</w:t>
+      </w:r>
+    </w:p>
+    <w:p>
+      <w:r>
+        <w:drawing>
+          <wp:inline xmlns:a="http://schemas.openxmlformats.org/drawingml/2006/main" xmlns:pic="http://schemas.openxmlformats.org/drawingml/2006/picture">
+            <wp:extent cx="2926080" cy="3350307"/>
+            <wp:docPr id="8" name="Picture 8"/>
+            <wp:cNvGraphicFramePr>
+              <a:graphicFrameLocks noChangeAspect="1"/>
+            </wp:cNvGraphicFramePr>
+            <a:graphic>
+              <a:graphicData uri="http://schemas.openxmlformats.org/drawingml/2006/picture">
+                <pic:pic>
+                  <pic:nvPicPr>
+                    <pic:cNvPr id="0" name="sample_gelombang_1.jpg"/>
+                    <pic:cNvPicPr/>
+                  </pic:nvPicPr>
+                  <pic:blipFill>
+                    <a:blip r:embed="rId16"/>
+                    <a:stretch>
+                      <a:fillRect/>
+                    </a:stretch>
+                  </pic:blipFill>
+                  <pic:spPr>
+                    <a:xfrm>
+                      <a:off x="0" y="0"/>
+                      <a:ext cx="2926080" cy="3350307"/>
+                    </a:xfrm>
+                    <a:prstGeom prst="rect"/>
+                  </pic:spPr>
+                </pic:pic>
+              </a:graphicData>
+            </a:graphic>
+          </wp:inline>
+        </w:drawing>
+      </w:r>
+    </w:p>
+    <w:p>
+      <w:pPr>
+        <w:spacing w:after="160"/>
+        <w:jc w:val="center"/>
+      </w:pPr>
+      <w:r>
+        <w:rPr>
+          <w:b/>
+          <w:sz w:val="19"/>
+        </w:rPr>
+        <w:t>Lampiran Gambar 5: Sampel Citra Uji Motif Gelombang Asli</w:t>
+      </w:r>
+    </w:p>
+    <w:p>
+      <w:r>
+        <w:drawing>
+          <wp:inline xmlns:a="http://schemas.openxmlformats.org/drawingml/2006/main" xmlns:pic="http://schemas.openxmlformats.org/drawingml/2006/picture">
+            <wp:extent cx="2926080" cy="2647127"/>
+            <wp:docPr id="9" name="Picture 9"/>
+            <wp:cNvGraphicFramePr>
+              <a:graphicFrameLocks noChangeAspect="1"/>
+            </wp:cNvGraphicFramePr>
+            <a:graphic>
+              <a:graphicData uri="http://schemas.openxmlformats.org/drawingml/2006/picture">
+                <pic:pic>
+                  <pic:nvPicPr>
+                    <pic:cNvPr id="0" name="sample_hiris_pudak_1.jpg"/>
+                    <pic:cNvPicPr/>
+                  </pic:nvPicPr>
+                  <pic:blipFill>
+                    <a:blip r:embed="rId17"/>
+                    <a:stretch>
+                      <a:fillRect/>
+                    </a:stretch>
+                  </pic:blipFill>
+                  <pic:spPr>
+                    <a:xfrm>
+                      <a:off x="0" y="0"/>
+                      <a:ext cx="2926080" cy="2647127"/>
+                    </a:xfrm>
+                    <a:prstGeom prst="rect"/>
+                  </pic:spPr>
+                </pic:pic>
+              </a:graphicData>
+            </a:graphic>
+          </wp:inline>
+        </w:drawing>
+      </w:r>
+    </w:p>
+    <w:p>
+      <w:pPr>
+        <w:spacing w:after="160"/>
+        <w:jc w:val="center"/>
+      </w:pPr>
+      <w:r>
+        <w:rPr>
+          <w:b/>
+          <w:sz w:val="19"/>
+        </w:rPr>
+        <w:t>Lampiran Gambar 6: Sampel Citra Uji Motif Hiris Pudak Asli</w:t>
+      </w:r>
+    </w:p>
+    <w:p>
+      <w:r>
+        <w:drawing>
+          <wp:inline xmlns:a="http://schemas.openxmlformats.org/drawingml/2006/main" xmlns:pic="http://schemas.openxmlformats.org/drawingml/2006/picture">
+            <wp:extent cx="2926080" cy="3481709"/>
+            <wp:docPr id="10" name="Picture 10"/>
+            <wp:cNvGraphicFramePr>
+              <a:graphicFrameLocks noChangeAspect="1"/>
+            </wp:cNvGraphicFramePr>
+            <a:graphic>
+              <a:graphicData uri="http://schemas.openxmlformats.org/drawingml/2006/picture">
+                <pic:pic>
+                  <pic:nvPicPr>
+                    <pic:cNvPr id="0" name="sample_kembang_kacang_1.jpg"/>
+                    <pic:cNvPicPr/>
+                  </pic:nvPicPr>
+                  <pic:blipFill>
+                    <a:blip r:embed="rId18"/>
+                    <a:stretch>
+                      <a:fillRect/>
+                    </a:stretch>
+                  </pic:blipFill>
+                  <pic:spPr>
+                    <a:xfrm>
+                      <a:off x="0" y="0"/>
+                      <a:ext cx="2926080" cy="3481709"/>
+                    </a:xfrm>
+                    <a:prstGeom prst="rect"/>
+                  </pic:spPr>
+                </pic:pic>
+              </a:graphicData>
+            </a:graphic>
+          </wp:inline>
+        </w:drawing>
+      </w:r>
+    </w:p>
+    <w:p>
+      <w:pPr>
+        <w:spacing w:after="160"/>
+        <w:jc w:val="center"/>
+      </w:pPr>
+      <w:r>
+        <w:rPr>
+          <w:b/>
+          <w:sz w:val="19"/>
+        </w:rPr>
+        <w:t>Lampiran Gambar 7: Sampel Citra Uji Motif Kembang Kacang Asli</w:t>
+      </w:r>
+    </w:p>
+    <w:p>
+      <w:r>
+        <w:drawing>
+          <wp:inline xmlns:a="http://schemas.openxmlformats.org/drawingml/2006/main" xmlns:pic="http://schemas.openxmlformats.org/drawingml/2006/picture">
+            <wp:extent cx="2926080" cy="5761623"/>
+            <wp:docPr id="11" name="Picture 11"/>
+            <wp:cNvGraphicFramePr>
+              <a:graphicFrameLocks noChangeAspect="1"/>
+            </wp:cNvGraphicFramePr>
+            <a:graphic>
+              <a:graphicData uri="http://schemas.openxmlformats.org/drawingml/2006/picture">
+                <pic:pic>
+                  <pic:nvPicPr>
+                    <pic:cNvPr id="0" name="sample_turun_dayang_1.jpg"/>
+                    <pic:cNvPicPr/>
+                  </pic:nvPicPr>
+                  <pic:blipFill>
+                    <a:blip r:embed="rId19"/>
+                    <a:stretch>
+                      <a:fillRect/>
+                    </a:stretch>
+                  </pic:blipFill>
+                  <pic:spPr>
+                    <a:xfrm>
+                      <a:off x="0" y="0"/>
+                      <a:ext cx="2926080" cy="5761623"/>
+                    </a:xfrm>
+                    <a:prstGeom prst="rect"/>
+                  </pic:spPr>
+                </pic:pic>
+              </a:graphicData>
+            </a:graphic>
+          </wp:inline>
+        </w:drawing>
+      </w:r>
+    </w:p>
+    <w:p>
+      <w:pPr>
+        <w:spacing w:after="160"/>
+        <w:jc w:val="center"/>
+      </w:pPr>
+      <w:r>
+        <w:rPr>
+          <w:b/>
+          <w:sz w:val="19"/>
+        </w:rPr>
+        <w:t>Lampiran Gambar 8: Sampel Citra Uji Motif Turun Dayang Asli</w:t>
       </w:r>
     </w:p>
     <w:sectPr>

</xml_diff>